<commit_message>
feat(lasi-refeq): upgrade Paper 2 to gold-standard GAMLSS/LMS (BCCG)
Full GAMLSS BCCG (L/M/S penalized splines) refit on healthy subset, scored the
30,995 analytic sample. Burden: PRISm 13.8% fixed / 4.0% LLN, RSP 14.4%/4.8%,
obstruction 6.6%; national reference recentres population (median FVC z -0.01).
Holdout SD 0.98-1.01 (tighter than quadratic). Manuscript/supplementary rewritten
(BCCG method, L/M/S table S2, GAMLSS lookup S3, Rigby-Stasinopoulos ref14);
quadratic retained as concordant sensitivity. Figures + docx regenerated.

Co-Authored-By: Claude Opus 4.8 <noreply@anthropic.com>
</commit_message>
<xml_diff>
--- a/india-ageing-atlas/prism_lasi_2026/national_ref_equations_2026/LASI_RefEq_Figures.docx
+++ b/india-ageing-atlas/prism_lasi_2026/national_ref_equations_2026/LASI_RefEq_Figures.docx
@@ -73,7 +73,7 @@
       <w:r>
         <w:drawing>
           <wp:inline xmlns:a="http://schemas.openxmlformats.org/drawingml/2006/main" xmlns:pic="http://schemas.openxmlformats.org/drawingml/2006/picture">
-            <wp:extent cx="5394960" cy="2252632"/>
+            <wp:extent cx="5394960" cy="3130094"/>
             <wp:docPr id="2" name="Picture 2"/>
             <wp:cNvGraphicFramePr>
               <a:graphicFrameLocks noChangeAspect="1"/>
@@ -94,7 +94,7 @@
                   <pic:spPr>
                     <a:xfrm>
                       <a:off x="0" y="0"/>
-                      <a:ext cx="5394960" cy="2252632"/>
+                      <a:ext cx="5394960" cy="3130094"/>
                     </a:xfrm>
                     <a:prstGeom prst="rect"/>
                   </pic:spPr>

</xml_diff>